<commit_message>
Recipient layout: postal code at top, name/address centred
- Mockup guide and Word template now place 〒 near the top of the page and
  the recipient name/address block in the centre (small top margin + large
  spacing after the postal-code paragraph).
- Regenerated Word doc (validated) and previews.

https://claude.ai/code/session_01MJaxTknHng2Rk6VQiM6LMA
</commit_message>
<xml_diff>
--- a/design/word/lien-envelopes.docx
+++ b/design/word/lien-envelopes.docx
@@ -4,7 +4,7 @@
   <w:body>
     <w:p>
       <w:pPr>
-        <w:spacing w:after="90"/>
+        <w:spacing w:after="5600"/>
       </w:pPr>
       <w:r>
         <w:drawing>
@@ -61,7 +61,7 @@
     </w:p>
     <w:p>
       <w:pPr>
-        <w:spacing w:after="90"/>
+        <w:spacing w:after="100"/>
       </w:pPr>
       <w:r>
         <w:rPr>
@@ -73,7 +73,7 @@
     </w:p>
     <w:p>
       <w:pPr>
-        <w:spacing w:after="90"/>
+        <w:spacing w:after="100"/>
       </w:pPr>
       <w:r>
         <w:rPr>
@@ -85,7 +85,7 @@
     </w:p>
     <w:p>
       <w:pPr>
-        <w:spacing w:after="160"/>
+        <w:spacing w:after="180"/>
       </w:pPr>
       <w:r>
         <w:rPr>
@@ -100,7 +100,7 @@
       <w:pPr>
         <w:sectPr>
           <w:pgSz w:w="13606" w:h="18822"/>
-          <w:pgMar w:top="6236" w:right="1134" w:bottom="3290" w:left="2041" w:header="720" w:footer="720" w:gutter="0"/>
+          <w:pgMar w:top="2268" w:right="1134" w:bottom="3290" w:left="2041" w:header="720" w:footer="720" w:gutter="0"/>
           <w:cols w:space="720"/>
           <w:docGrid w:type="lines" w:linePitch="360"/>
         </w:sectPr>
@@ -108,7 +108,7 @@
     </w:p>
     <w:p>
       <w:pPr>
-        <w:spacing w:after="90"/>
+        <w:spacing w:after="4000"/>
       </w:pPr>
       <w:r>
         <w:drawing>
@@ -165,7 +165,7 @@
     </w:p>
     <w:p>
       <w:pPr>
-        <w:spacing w:after="90"/>
+        <w:spacing w:after="100"/>
       </w:pPr>
       <w:r>
         <w:rPr>
@@ -177,7 +177,7 @@
     </w:p>
     <w:p>
       <w:pPr>
-        <w:spacing w:after="90"/>
+        <w:spacing w:after="100"/>
       </w:pPr>
       <w:r>
         <w:rPr>
@@ -189,7 +189,7 @@
     </w:p>
     <w:p>
       <w:pPr>
-        <w:spacing w:after="160"/>
+        <w:spacing w:after="180"/>
       </w:pPr>
       <w:r>
         <w:rPr>
@@ -202,7 +202,7 @@
     </w:p>
     <w:sectPr>
       <w:pgSz w:w="6803" w:h="13323"/>
-      <w:pgMar w:top="4422" w:right="567" w:bottom="2381" w:left="1020" w:header="720" w:footer="720" w:gutter="0"/>
+      <w:pgMar w:top="1587" w:right="567" w:bottom="2381" w:left="1020" w:header="720" w:footer="720" w:gutter="0"/>
       <w:cols w:space="720"/>
       <w:docGrid w:type="lines" w:linePitch="360"/>
     </w:sectPr>

</xml_diff>